<commit_message>
feat: cap nhat toan bo UI mockups va tai lieu SRS Boi thuong nha nuoc
</commit_message>
<xml_diff>
--- a/Bieu_mau/Boi_thuong_nha_nuoc/Mau_02_BTNN_Template.docx
+++ b/Bieu_mau/Boi_thuong_nha_nuoc/Mau_02_BTNN_Template.docx
@@ -1,6 +1,6 @@
 
 <file path=word/document.xml><?xml version="1.0" encoding="utf-8"?>
-<w:document xmlns:w="http://schemas.openxmlformats.org/wordprocessingml/2006/main" xmlns:r="http://schemas.openxmlformats.org/officeDocument/2006/relationships">
+<w:document xmlns:wpc="http://schemas.microsoft.com/office/word/2010/wordprocessingCanvas" xmlns:cx="http://schemas.microsoft.com/office/drawing/2014/chartex" xmlns:cx1="http://schemas.microsoft.com/office/drawing/2015/9/8/chartex" xmlns:cx2="http://schemas.microsoft.com/office/drawing/2015/10/21/chartex" xmlns:cx3="http://schemas.microsoft.com/office/drawing/2016/5/9/chartex" xmlns:cx4="http://schemas.microsoft.com/office/drawing/2016/5/10/chartex" xmlns:cx5="http://schemas.microsoft.com/office/drawing/2016/5/11/chartex" xmlns:cx6="http://schemas.microsoft.com/office/drawing/2016/5/12/chartex" xmlns:cx7="http://schemas.microsoft.com/office/drawing/2016/5/13/chartex" xmlns:cx8="http://schemas.microsoft.com/office/drawing/2016/5/14/chartex" xmlns:mc="http://schemas.openxmlformats.org/markup-compatibility/2006" xmlns:aink="http://schemas.microsoft.com/office/drawing/2016/ink" xmlns:am3d="http://schemas.microsoft.com/office/drawing/2017/model3d" xmlns:o="urn:schemas-microsoft-com:office:office" xmlns:r="http://schemas.openxmlformats.org/officeDocument/2006/relationships" xmlns:m="http://schemas.openxmlformats.org/officeDocument/2006/math" xmlns:v="urn:schemas-microsoft-com:vml" xmlns:wp14="http://schemas.microsoft.com/office/word/2010/wordprocessingDrawing" xmlns:wp="http://schemas.openxmlformats.org/drawingml/2006/wordprocessingDrawing" xmlns:w10="urn:schemas-microsoft-com:office:word" xmlns:w="http://schemas.openxmlformats.org/wordprocessingml/2006/main" xmlns:w14="http://schemas.microsoft.com/office/word/2010/wordml" xmlns:w15="http://schemas.microsoft.com/office/word/2012/wordml" xmlns:w16cid="http://schemas.microsoft.com/office/word/2016/wordml/cid" xmlns:w16se="http://schemas.microsoft.com/office/word/2015/wordml/symex" xmlns:wpg="http://schemas.microsoft.com/office/word/2010/wordprocessingGroup" xmlns:wpi="http://schemas.microsoft.com/office/word/2010/wordprocessingInk" xmlns:wne="http://schemas.microsoft.com/office/word/2006/wordml" xmlns:wps="http://schemas.microsoft.com/office/word/2010/wordprocessingShape" mc:Ignorable="w14 w15 w16se w16cid wp14">
   <w:body>
     <w:p>
       <w:pPr>
@@ -151,6 +151,11 @@
       <w:pPr>
         <w:spacing w:before="240"/>
         <w:jc w:val="center"/>
+        <w:rPr>
+          <w:b/>
+          <w:sz w:val="28"/>
+          <w:szCs w:val="28"/>
+        </w:rPr>
       </w:pPr>
       <w:r>
         <w:rPr>
@@ -163,8 +168,16 @@
     </w:p>
     <w:p>
       <w:pPr>
+        <w:spacing w:before="240"/>
+        <w:jc w:val="center"/>
+      </w:pPr>
+      <w:bookmarkStart w:id="0" w:name="_GoBack"/>
+      <w:bookmarkEnd w:id="0"/>
+    </w:p>
+    <w:p>
+      <w:pPr>
+        <w:spacing w:after="120" w:line="276" w:lineRule="auto"/>
         <w:jc w:val="both"/>
-        <w:spacing w:after="120" w:line="276" w:lineRule="auto"/>
       </w:pPr>
       <w:r>
         <w:rPr>
@@ -172,75 +185,82 @@
           <w:sz w:val="28"/>
           <w:szCs w:val="28"/>
         </w:rPr>
-        <w:t xml:space="preserve">Kính gửi: ##TenNguoiYeuCauBoiThuong##</w:t>
+        <w:t>Kính gửi: ##TenNguoiYeuCauBoiThuong##</w:t>
       </w:r>
     </w:p>
     <w:p>
       <w:pPr>
+        <w:spacing w:after="120" w:line="276" w:lineRule="auto"/>
         <w:jc w:val="both"/>
-        <w:spacing w:after="120" w:line="276" w:lineRule="auto"/>
       </w:pPr>
       <w:r>
         <w:rPr>
           <w:sz w:val="28"/>
           <w:szCs w:val="28"/>
         </w:rPr>
-        <w:t xml:space="preserve">Địa chỉ: ##DiaChiNguoiYeuCauBoiThuong##</w:t>
+        <w:t>Địa chỉ: ##DiaChiNguoiYeuCauBoiThuong##</w:t>
       </w:r>
     </w:p>
     <w:p>
       <w:pPr>
+        <w:spacing w:after="120" w:line="276" w:lineRule="auto"/>
         <w:jc w:val="both"/>
-        <w:spacing w:after="120" w:line="276" w:lineRule="auto"/>
       </w:pPr>
       <w:r>
         <w:rPr>
           <w:sz w:val="28"/>
           <w:szCs w:val="28"/>
         </w:rPr>
-        <w:t xml:space="preserve">Điện thoại: ##SoDienThoaiNguoiYeuCau##</w:t>
+        <w:t>Điện thoại: ##SoDienThoaiNguoiYeuCau##</w:t>
       </w:r>
     </w:p>
     <w:p>
       <w:pPr>
+        <w:spacing w:after="120" w:line="276" w:lineRule="auto"/>
+        <w:ind w:firstLine="567"/>
         <w:jc w:val="both"/>
-        <w:ind w:firstLine="567"/>
-        <w:spacing w:after="120" w:line="276" w:lineRule="auto"/>
       </w:pPr>
       <w:r>
         <w:rPr>
           <w:sz w:val="28"/>
           <w:szCs w:val="28"/>
         </w:rPr>
-        <w:t xml:space="preserve">Ngày ##NgayTiepNhan##, ##TenCoQuanGiaiQuyetBoiThuong## đã nhận được văn bản yêu cầu bồi thường/hồ sơ yêu cầu bồi thường của Ông/Bà nộp ##HinhThucNopHoSo##. Chúng tôi sẽ xử lý yêu cầu bồi thường của Ông/Bà theo quy định.</w:t>
+        <w:t>Ngày ##NgayTiepNhan##, ##TenCoQuanGiaiQuyetBoiThuong## đã nhận được văn bản yêu cầu bồi thường/hồ sơ yêu cầu bồi thường của Ông/Bà nộp ##HinhThucNopHoSo##. Chúng tôi sẽ xử lý yêu cầu bồi thường của Ông/Bà theo quy định.</w:t>
       </w:r>
     </w:p>
     <w:p>
       <w:pPr>
+        <w:spacing w:after="120" w:line="276" w:lineRule="auto"/>
+        <w:ind w:firstLine="567"/>
         <w:jc w:val="both"/>
-        <w:ind w:firstLine="567"/>
-        <w:spacing w:after="120" w:line="276" w:lineRule="auto"/>
       </w:pPr>
       <w:r>
         <w:rPr>
           <w:sz w:val="28"/>
           <w:szCs w:val="28"/>
         </w:rPr>
-        <w:t xml:space="preserve">Hồ sơ yêu cầu bồi thường gồm: (nếu có)</w:t>
+        <w:t>Hồ sơ yêu cầu bồi thường gồm: (nếu c</w:t>
+      </w:r>
+      <w:r>
+        <w:rPr>
+          <w:sz w:val="28"/>
+          <w:szCs w:val="28"/>
+        </w:rPr>
+        <w:t>ó)</w:t>
       </w:r>
     </w:p>
     <w:p>
       <w:pPr>
+        <w:spacing w:after="120" w:line="276" w:lineRule="auto"/>
+        <w:ind w:firstLine="567"/>
         <w:jc w:val="both"/>
-        <w:ind w:firstLine="567"/>
-        <w:spacing w:after="120" w:line="276" w:lineRule="auto"/>
       </w:pPr>
       <w:r>
         <w:rPr>
           <w:sz w:val="28"/>
           <w:szCs w:val="28"/>
         </w:rPr>
-        <w:t xml:space="preserve">##DanhSachGiayToTiepNhan##</w:t>
+        <w:t>##DanhSachGiayToTiepNhan##</w:t>
       </w:r>
     </w:p>
     <w:tbl>
@@ -286,7 +306,7 @@
                 <w:sz w:val="22"/>
                 <w:szCs w:val="22"/>
               </w:rPr>
-              <w:t xml:space="preserve">- Như trên;</w:t>
+              <w:t>- Như trên;</w:t>
             </w:r>
           </w:p>
           <w:p>
@@ -295,7 +315,7 @@
                 <w:sz w:val="22"/>
                 <w:szCs w:val="22"/>
               </w:rPr>
-              <w:t xml:space="preserve">- Lưu: VT, HSVV.</w:t>
+              <w:t>- Lưu: VT, HSVV.</w:t>
             </w:r>
           </w:p>
         </w:tc>
@@ -348,6 +368,7 @@
         </w:tc>
       </w:tr>
     </w:tbl>
+    <w:p/>
     <w:sectPr>
       <w:pgSz w:w="11906" w:h="16838"/>
       <w:pgMar w:top="1134" w:right="850" w:bottom="1134" w:left="1701" w:header="567" w:footer="567" w:gutter="0"/>

</xml_diff>

<commit_message>
backup(btnn): đồng bộ UI mockup + SRS + biểu mẫu BTNN đến 26/10/2026
- Ký duyệt/Từ chối: mô tả chung ở SRS XĐCQ, phân hệ tự mô tả xử lý; bỏ file ViecChoLanhDao
- GQ YCBT: thao tác lưới/chi tiết theo trạng thái, 3 tab, Hoãn/Tạm đình chỉ/Đình chỉ/Tiếp tục (Mẫu 22/23/25), Mẫu 26 PHDD, Yêu cầu bổ sung
- QĐ GQBT, Kinh phí (màn chi tiết dạng trang), Hoàn trả (màn Ký duyệt), Tra cứu gộp 1 SRS
- Đồng nhất: badge Chờ xử lý + LeftMenu, cột Thao tác cố định, bảng Tài liệu kèm theo, nhãn, tiêu đề trang
- Mapping + template biểu mẫu rà soát theo file chuẩn

Co-Authored-By: Claude Opus 5.5 <noreply@anthropic.com>
</commit_message>
<xml_diff>
--- a/Bieu_mau/Boi_thuong_nha_nuoc/Mau_02_BTNN_Template.docx
+++ b/Bieu_mau/Boi_thuong_nha_nuoc/Mau_02_BTNN_Template.docx
@@ -95,7 +95,7 @@
                 <w:sz w:val="26"/>
                 <w:szCs w:val="26"/>
               </w:rPr>
-              <w:t>Số: ##SoKyHieuVanBan##</w:t>
+              <w:t>Số: ……/TB-……</w:t>
             </w:r>
           </w:p>
         </w:tc>
@@ -225,7 +225,7 @@
           <w:sz w:val="28"/>
           <w:szCs w:val="28"/>
         </w:rPr>
-        <w:t>Ngày ##NgayTiepNhan##, ##TenCoQuanGiaiQuyetBoiThuong## đã nhận được văn bản yêu cầu bồi thường/hồ sơ yêu cầu bồi thường của Ông/Bà nộp ##HinhThucNopHoSo##. Chúng tôi sẽ xử lý yêu cầu bồi thường của Ông/Bà theo quy định.</w:t>
+        <w:t>Ngày ##NgayTiepNhan##, ##TenCoQuanGiaiQuyetBoiThuong## đã nhận được văn bản yêu cầu bồi thường/hồ sơ yêu cầu bồi thường của Ông/Bà qua ##HinhThucNopHoSo##. Chúng tôi sẽ xử lý yêu cầu bồi thường của Ông/bà theo quy định.</w:t>
       </w:r>
     </w:p>
     <w:p>
@@ -315,6 +315,15 @@
                 <w:sz w:val="22"/>
                 <w:szCs w:val="22"/>
               </w:rPr>
+              <w:t xml:space="preserve">- ##TenCoQuanGiaiQuyetBoiThuong## (để biết);</w:t>
+            </w:r>
+          </w:p>
+          <w:p>
+            <w:r>
+              <w:rPr>
+                <w:sz w:val="22"/>
+                <w:szCs w:val="22"/>
+              </w:rPr>
               <w:t>- Lưu: VT, HSVV.</w:t>
             </w:r>
           </w:p>
@@ -335,7 +344,7 @@
                 <w:sz w:val="28"/>
                 <w:szCs w:val="28"/>
               </w:rPr>
-              <w:t>##ChucVuNguoiDungDau##</w:t>
+              <w:t>##ChucVuNguoiKy##</w:t>
             </w:r>
           </w:p>
           <w:p>
@@ -362,7 +371,7 @@
                 <w:sz w:val="28"/>
                 <w:szCs w:val="28"/>
               </w:rPr>
-              <w:t>##HoTenNguoiKy##</w:t>
+              <w:t/>
             </w:r>
           </w:p>
         </w:tc>

</xml_diff>